<commit_message>
Update feature report for 0.14.0 with AI translation and keyboard navigation
</commit_message>
<xml_diff>
--- a/doc/2026-09-03_LocaleGrid_개발_기능_보고서.docx
+++ b/doc/2026-09-03_LocaleGrid_개발_기능_보고서.docx
@@ -273,7 +273,7 @@
                 <w:sz w:val="18"/>
                 <w:lang w:eastAsia="ko-KR"/>
               </w:rPr>
-              <w:t xml:space="preserve">통합 표 에디터, 실시간 오류 감지, 필터/검색, 안전한 Diff 저장, 엑셀 내보내기</w:t>
+              <w:t xml:space="preserve">통합 표 에디터, 실시간 오류 감지, 필터/검색, 사내 AI 번역 제안(LLM 연동), 안전한 Diff 저장, 엑셀 내보내기</w:t>
             </w:r>
           </w:p>
         </w:tc>
@@ -302,7 +302,7 @@
                 <w:sz w:val="18"/>
                 <w:lang w:eastAsia="ko-KR"/>
               </w:rPr>
-              <w:t xml:space="preserve">작성 기준일</w:t>
+              <w:t xml:space="preserve">구현 범위</w:t>
             </w:r>
           </w:p>
         </w:tc>
@@ -329,6 +329,62 @@
                 <w:sz w:val="18"/>
                 <w:lang w:eastAsia="ko-KR"/>
               </w:rPr>
+              <w:t xml:space="preserve">프로덕션 Java 40개 파일 및 자동화 테스트 21개 클래스(총 117개 테스트) 전수 검증</w:t>
+            </w:r>
+          </w:p>
+        </w:tc>
+      </w:tr>
+      <w:tr>
+        <w:tc>
+          <w:tcPr>
+            <w:tcW w:w="2200" w:type="dxa"/>
+            <w:shd w:val="clear" w:fill="FFFFFF"/>
+            <w:tcMar>
+              <w:top w:w="100"/>
+              <w:bottom w:w="100"/>
+              <w:left w:w="140"/>
+              <w:right w:w="140"/>
+            </w:tcMar>
+          </w:tcPr>
+          <w:p>
+            <w:pPr>
+              <w:spacing w:before="30" w:after="30"/>
+              <w:line w:line="240" w:lineRule="auto"/>
+            </w:pPr>
+            <w:r>
+              <w:rPr>
+                <w:rFonts w:ascii="Apple SD Gothic Neo" w:hAnsi="Apple SD Gothic Neo" w:eastAsia="Apple SD Gothic Neo"/>
+                <w:color w:val="334155"/>
+                <w:sz w:val="18"/>
+                <w:lang w:eastAsia="ko-KR"/>
+              </w:rPr>
+              <w:t xml:space="preserve">작성 기준일</w:t>
+            </w:r>
+          </w:p>
+        </w:tc>
+        <w:tc>
+          <w:tcPr>
+            <w:tcW w:w="7400" w:type="dxa"/>
+            <w:shd w:val="clear" w:fill="FFFFFF"/>
+            <w:tcMar>
+              <w:top w:w="100"/>
+              <w:bottom w:w="100"/>
+              <w:left w:w="140"/>
+              <w:right w:w="140"/>
+            </w:tcMar>
+          </w:tcPr>
+          <w:p>
+            <w:pPr>
+              <w:spacing w:before="30" w:after="30"/>
+              <w:line w:line="240" w:lineRule="auto"/>
+            </w:pPr>
+            <w:r>
+              <w:rPr>
+                <w:rFonts w:ascii="Apple SD Gothic Neo" w:hAnsi="Apple SD Gothic Neo" w:eastAsia="Apple SD Gothic Neo"/>
+                <w:color w:val="334155"/>
+                <w:sz w:val="18"/>
+                <w:lang w:eastAsia="ko-KR"/>
+              </w:rPr>
               <w:t xml:space="preserve">2026년 09월</w:t>
             </w:r>
           </w:p>
@@ -481,7 +537,7 @@
           <w:sz w:val="20"/>
           <w:lang w:eastAsia="ko-KR"/>
         </w:rPr>
-        <w:t xml:space="preserve">간편한 검색과 필요한 항목 골라보기: </w:t>
+        <w:t xml:space="preserve">간편한 검색과 키보드 양방향 탐색: </w:t>
       </w:r>
       <w:r>
         <w:rPr>
@@ -490,7 +546,42 @@
           <w:sz w:val="20"/>
           <w:lang w:eastAsia="ko-KR"/>
         </w:rPr>
-        <w:t xml:space="preserve">단어를 입력하면 번역문을 즉시 찾아주고, 추가·수정·주의 항목만 버튼 하나로 모아서 확인.</w:t>
+        <w:t xml:space="preserve">단어를 입력하면 일치하는 번역문을 즉시 찾아주고, 방향키(↑/↓)와 단축키(Enter/Shift+Enter, F3/Shift+F3)로 이전·다음 결과를 빠르고 자유롭게 순환 탐색.</w:t>
+      </w:r>
+    </w:p>
+    <w:p>
+      <w:pPr>
+        <w:spacing w:before="40" w:after="40" w:line="260" w:lineRule="auto"/>
+        <w:ind w:left="360" w:hanging="240"/>
+      </w:pPr>
+      <w:r>
+        <w:rPr>
+          <w:rFonts w:ascii="Apple SD Gothic Neo" w:hAnsi="Apple SD Gothic Neo" w:eastAsia="Apple SD Gothic Neo"/>
+          <w:color w:val="2563EB"/>
+          <w:b/>
+          <w:sz w:val="20"/>
+          <w:lang w:eastAsia="ko-KR"/>
+        </w:rPr>
+        <w:t xml:space="preserve">•  </w:t>
+      </w:r>
+      <w:r>
+        <w:rPr>
+          <w:rFonts w:ascii="Apple SD Gothic Neo" w:hAnsi="Apple SD Gothic Neo" w:eastAsia="Apple SD Gothic Neo"/>
+          <w:color w:val="1E3A5F"/>
+          <w:b/>
+          <w:sz w:val="20"/>
+          <w:lang w:eastAsia="ko-KR"/>
+        </w:rPr>
+        <w:t xml:space="preserve">사내 AI 다국어 번역 제안: </w:t>
+      </w:r>
+      <w:r>
+        <w:rPr>
+          <w:rFonts w:ascii="Apple SD Gothic Neo" w:hAnsi="Apple SD Gothic Neo" w:eastAsia="Apple SD Gothic Neo"/>
+          <w:color w:val="374151"/>
+          <w:sz w:val="20"/>
+          <w:lang w:eastAsia="ko-KR"/>
+        </w:rPr>
+        <w:t xml:space="preserve">기존에 작성된 다른 언어 문맥을 참고하여 사내 로컬 LLM이 비어 있는 언어의 번역을 추천해 주며, 추천 칩을 클릭하거나 Enter/Space 키로 즉시 표에 적용.</w:t>
       </w:r>
     </w:p>
     <w:p>
@@ -793,7 +884,7 @@
           <w:sz w:val="20"/>
           <w:lang w:eastAsia="ko-KR"/>
         </w:rPr>
-        <w:t xml:space="preserve">3. 인메모리 도메인 모델: </w:t>
+        <w:t xml:space="preserve">3. 인메모리 도메인 모델 &amp; AI 서비스: </w:t>
       </w:r>
       <w:r>
         <w:rPr>
@@ -802,7 +893,7 @@
           <w:sz w:val="20"/>
           <w:lang w:eastAsia="ko-KR"/>
         </w:rPr>
-        <w:t xml:space="preserve">TranslationTable, LocaleGridRow, LocaleValue, Diagnostic, ExceptionKeyMarker.</w:t>
+        <w:t xml:space="preserve">TranslationTable, LocaleGridRow, LocaleValue, Diagnostic, ExceptionKeyMarker, LocaleGridLlmClient, TranslationSuggestionService, TranslationSuggestionChip.</w:t>
       </w:r>
     </w:p>
     <w:p>
@@ -837,7 +928,7 @@
           <w:sz w:val="20"/>
           <w:lang w:eastAsia="ko-KR"/>
         </w:rPr>
-        <w:t xml:space="preserve">LocaleGrid 다국어 표 및 상세 편집 레이아웃, 상태 배지, 미니맵, 미리보기 창, 엑셀 내보내기.</w:t>
+        <w:t xml:space="preserve">LocaleGrid 다국어 표 및 상세 편집 레이아웃, 추천 번역 칩, 상태 배지, 미니맵, 미리보기 창, 엑셀 내보내기.</w:t>
       </w:r>
     </w:p>
     <w:p>
@@ -1434,6 +1525,255 @@
           </w:p>
         </w:tc>
       </w:tr>
+      <w:tr>
+        <w:tc>
+          <w:tcPr>
+            <w:tcW w:w="2200" w:type="dxa"/>
+            <w:shd w:val="clear" w:fill="FAFAFA"/>
+            <w:tcMar>
+              <w:top w:w="100"/>
+              <w:bottom w:w="100"/>
+              <w:left w:w="140"/>
+              <w:right w:w="140"/>
+            </w:tcMar>
+          </w:tcPr>
+          <w:p>
+            <w:pPr>
+              <w:spacing w:before="30" w:after="30"/>
+              <w:line w:line="240" w:lineRule="auto"/>
+            </w:pPr>
+            <w:r>
+              <w:rPr>
+                <w:rFonts w:ascii="Apple SD Gothic Neo" w:hAnsi="Apple SD Gothic Neo" w:eastAsia="Apple SD Gothic Neo"/>
+                <w:color w:val="334155"/>
+                <w:sz w:val="18"/>
+                <w:lang w:eastAsia="ko-KR"/>
+              </w:rPr>
+              <w:t xml:space="preserve">LocaleGridLlmClient</w:t>
+            </w:r>
+          </w:p>
+        </w:tc>
+        <w:tc>
+          <w:tcPr>
+            <w:tcW w:w="3700" w:type="dxa"/>
+            <w:shd w:val="clear" w:fill="FAFAFA"/>
+            <w:tcMar>
+              <w:top w:w="100"/>
+              <w:bottom w:w="100"/>
+              <w:left w:w="140"/>
+              <w:right w:w="140"/>
+            </w:tcMar>
+          </w:tcPr>
+          <w:p>
+            <w:pPr>
+              <w:spacing w:before="30" w:after="30"/>
+              <w:line w:line="240" w:lineRule="auto"/>
+            </w:pPr>
+            <w:r>
+              <w:rPr>
+                <w:rFonts w:ascii="Apple SD Gothic Neo" w:hAnsi="Apple SD Gothic Neo" w:eastAsia="Apple SD Gothic Neo"/>
+                <w:color w:val="334155"/>
+                <w:sz w:val="18"/>
+                <w:lang w:eastAsia="ko-KR"/>
+              </w:rPr>
+              <w:t xml:space="preserve">사내 호스팅 Qwen, vLLM, Ollama 및 OpenAI 호환 LLM 엔드포인트와 비동기 통신하는 HTTP 클라이언트.</w:t>
+            </w:r>
+          </w:p>
+        </w:tc>
+        <w:tc>
+          <w:tcPr>
+            <w:tcW w:w="3700" w:type="dxa"/>
+            <w:shd w:val="clear" w:fill="FAFAFA"/>
+            <w:tcMar>
+              <w:top w:w="100"/>
+              <w:bottom w:w="100"/>
+              <w:left w:w="140"/>
+              <w:right w:w="140"/>
+            </w:tcMar>
+          </w:tcPr>
+          <w:p>
+            <w:pPr>
+              <w:spacing w:before="30" w:after="30"/>
+              <w:line w:line="240" w:lineRule="auto"/>
+            </w:pPr>
+            <w:r>
+              <w:rPr>
+                <w:rFonts w:ascii="Apple SD Gothic Neo" w:hAnsi="Apple SD Gothic Neo" w:eastAsia="Apple SD Gothic Neo"/>
+                <w:color w:val="334155"/>
+                <w:sz w:val="18"/>
+                <w:lang w:eastAsia="ko-KR"/>
+              </w:rPr>
+              <w:t xml:space="preserve">Java 11+ 내장 HttpClient 기반 비동기 호출, 실시간 연결 테스트, 타임아웃 제어 및 응답 무결성 검증.</w:t>
+            </w:r>
+          </w:p>
+        </w:tc>
+      </w:tr>
+      <w:tr>
+        <w:tc>
+          <w:tcPr>
+            <w:tcW w:w="2200" w:type="dxa"/>
+            <w:shd w:val="clear" w:fill="FFFFFF"/>
+            <w:tcMar>
+              <w:top w:w="100"/>
+              <w:bottom w:w="100"/>
+              <w:left w:w="140"/>
+              <w:right w:w="140"/>
+            </w:tcMar>
+          </w:tcPr>
+          <w:p>
+            <w:pPr>
+              <w:spacing w:before="30" w:after="30"/>
+              <w:line w:line="240" w:lineRule="auto"/>
+            </w:pPr>
+            <w:r>
+              <w:rPr>
+                <w:rFonts w:ascii="Apple SD Gothic Neo" w:hAnsi="Apple SD Gothic Neo" w:eastAsia="Apple SD Gothic Neo"/>
+                <w:color w:val="334155"/>
+                <w:sz w:val="18"/>
+                <w:lang w:eastAsia="ko-KR"/>
+              </w:rPr>
+              <w:t xml:space="preserve">TranslationSuggestionService</w:t>
+            </w:r>
+          </w:p>
+        </w:tc>
+        <w:tc>
+          <w:tcPr>
+            <w:tcW w:w="3700" w:type="dxa"/>
+            <w:shd w:val="clear" w:fill="FFFFFF"/>
+            <w:tcMar>
+              <w:top w:w="100"/>
+              <w:bottom w:w="100"/>
+              <w:left w:w="140"/>
+              <w:right w:w="140"/>
+            </w:tcMar>
+          </w:tcPr>
+          <w:p>
+            <w:pPr>
+              <w:spacing w:before="30" w:after="30"/>
+              <w:line w:line="240" w:lineRule="auto"/>
+            </w:pPr>
+            <w:r>
+              <w:rPr>
+                <w:rFonts w:ascii="Apple SD Gothic Neo" w:hAnsi="Apple SD Gothic Neo" w:eastAsia="Apple SD Gothic Neo"/>
+                <w:color w:val="334155"/>
+                <w:sz w:val="18"/>
+                <w:lang w:eastAsia="ko-KR"/>
+              </w:rPr>
+              <w:t xml:space="preserve">다국어 키와 기존 입력된 언어 문장을 문맥으로 종합하여 비어 있는 대상 언어의 번역을 LLM에 질의하고 추천하는 서비스.</w:t>
+            </w:r>
+          </w:p>
+        </w:tc>
+        <w:tc>
+          <w:tcPr>
+            <w:tcW w:w="3700" w:type="dxa"/>
+            <w:shd w:val="clear" w:fill="FFFFFF"/>
+            <w:tcMar>
+              <w:top w:w="100"/>
+              <w:bottom w:w="100"/>
+              <w:left w:w="140"/>
+              <w:right w:w="140"/>
+            </w:tcMar>
+          </w:tcPr>
+          <w:p>
+            <w:pPr>
+              <w:spacing w:before="30" w:after="30"/>
+              <w:line w:line="240" w:lineRule="auto"/>
+            </w:pPr>
+            <w:r>
+              <w:rPr>
+                <w:rFonts w:ascii="Apple SD Gothic Neo" w:hAnsi="Apple SD Gothic Neo" w:eastAsia="Apple SD Gothic Neo"/>
+                <w:color w:val="334155"/>
+                <w:sz w:val="18"/>
+                <w:lang w:eastAsia="ko-KR"/>
+              </w:rPr>
+              <w:t xml:space="preserve">정형 JSON 응답 유도 시스템 프롬프트 및 불필요한 추론(thinking) 출력 제어로 통신 지연 최소화 및 안정성 확보.</w:t>
+            </w:r>
+          </w:p>
+        </w:tc>
+      </w:tr>
+      <w:tr>
+        <w:tc>
+          <w:tcPr>
+            <w:tcW w:w="2200" w:type="dxa"/>
+            <w:shd w:val="clear" w:fill="FAFAFA"/>
+            <w:tcMar>
+              <w:top w:w="100"/>
+              <w:bottom w:w="100"/>
+              <w:left w:w="140"/>
+              <w:right w:w="140"/>
+            </w:tcMar>
+          </w:tcPr>
+          <w:p>
+            <w:pPr>
+              <w:spacing w:before="30" w:after="30"/>
+              <w:line w:line="240" w:lineRule="auto"/>
+            </w:pPr>
+            <w:r>
+              <w:rPr>
+                <w:rFonts w:ascii="Apple SD Gothic Neo" w:hAnsi="Apple SD Gothic Neo" w:eastAsia="Apple SD Gothic Neo"/>
+                <w:color w:val="334155"/>
+                <w:sz w:val="18"/>
+                <w:lang w:eastAsia="ko-KR"/>
+              </w:rPr>
+              <w:t xml:space="preserve">TranslationSuggestionChip</w:t>
+            </w:r>
+          </w:p>
+        </w:tc>
+        <w:tc>
+          <w:tcPr>
+            <w:tcW w:w="3700" w:type="dxa"/>
+            <w:shd w:val="clear" w:fill="FAFAFA"/>
+            <w:tcMar>
+              <w:top w:w="100"/>
+              <w:bottom w:w="100"/>
+              <w:left w:w="140"/>
+              <w:right w:w="140"/>
+            </w:tcMar>
+          </w:tcPr>
+          <w:p>
+            <w:pPr>
+              <w:spacing w:before="30" w:after="30"/>
+              <w:line w:line="240" w:lineRule="auto"/>
+            </w:pPr>
+            <w:r>
+              <w:rPr>
+                <w:rFonts w:ascii="Apple SD Gothic Neo" w:hAnsi="Apple SD Gothic Neo" w:eastAsia="Apple SD Gothic Neo"/>
+                <w:color w:val="334155"/>
+                <w:sz w:val="18"/>
+                <w:lang w:eastAsia="ko-KR"/>
+              </w:rPr>
+              <w:t xml:space="preserve">비어 있는 번역 입력란에 보라색 별 아이콘과 추천 번역 문구를 표시하는 대화형 제안 칩 UI 컴포넌트.</w:t>
+            </w:r>
+          </w:p>
+        </w:tc>
+        <w:tc>
+          <w:tcPr>
+            <w:tcW w:w="3700" w:type="dxa"/>
+            <w:shd w:val="clear" w:fill="FAFAFA"/>
+            <w:tcMar>
+              <w:top w:w="100"/>
+              <w:bottom w:w="100"/>
+              <w:left w:w="140"/>
+              <w:right w:w="140"/>
+            </w:tcMar>
+          </w:tcPr>
+          <w:p>
+            <w:pPr>
+              <w:spacing w:before="30" w:after="30"/>
+              <w:line w:line="240" w:lineRule="auto"/>
+            </w:pPr>
+            <w:r>
+              <w:rPr>
+                <w:rFonts w:ascii="Apple SD Gothic Neo" w:hAnsi="Apple SD Gothic Neo" w:eastAsia="Apple SD Gothic Neo"/>
+                <w:color w:val="334155"/>
+                <w:sz w:val="18"/>
+                <w:lang w:eastAsia="ko-KR"/>
+              </w:rPr>
+              <w:t xml:space="preserve">마우스 원클릭 또는 Enter/Space 키 즉시 적용, 닫기 액션 분리, 가용 너비 맞춤 말줄임 및 전체 문구 툴팁 제공.</w:t>
+            </w:r>
+          </w:p>
+        </w:tc>
+      </w:tr>
     </w:tbl>
     <w:p>
       <w:pPr>
@@ -3640,7 +3980,7 @@
           <w:sz w:val="20"/>
           <w:lang w:eastAsia="ko-KR"/>
         </w:rPr>
-        <w:t xml:space="preserve">실시간 단어 검색 및 강조: </w:t>
+        <w:t xml:space="preserve">실시간 단어 검색 및 키보드 양방향 탐색: </w:t>
       </w:r>
       <w:r>
         <w:rPr>
@@ -3649,7 +3989,7 @@
           <w:sz w:val="20"/>
           <w:lang w:eastAsia="ko-KR"/>
         </w:rPr>
-        <w:t xml:space="preserve">500ms 디바운스를 적용하여 검색창 입력 시 일치 항목을 파란색 배경과 볼드 텍스트로 실시간 강조하며, 이전/다음 내비게이션을 지원합니다.</w:t>
+        <w:t xml:space="preserve">500ms 디바운스를 적용하여 검색창 입력 시 일치 항목을 파란색 볼드로 실시간 강조합니다. 검색창에서 방향키(↑/↓)와 Enter/Shift+Enter, 테이블 포커스 시 F3/Shift+F3 키로 매칭 결과를 양방향 순환 탐색하며, 툴팁으로 단축키 가이드를 제공합니다.</w:t>
       </w:r>
     </w:p>
     <w:p>
@@ -3745,7 +4085,7 @@
           <w:sz w:val="20"/>
           <w:lang w:eastAsia="ko-KR"/>
         </w:rPr>
-        <w:t xml:space="preserve">하단 상세 편집 패널 (Detail Panel): </w:t>
+        <w:t xml:space="preserve">하단 상세 편집 패널 및 AI 번역 연동: </w:t>
       </w:r>
       <w:r>
         <w:rPr>
@@ -3754,7 +4094,7 @@
           <w:sz w:val="20"/>
           <w:lang w:eastAsia="ko-KR"/>
         </w:rPr>
-        <w:t xml:space="preserve">선택된 키의 언어별 번역값을 개별 입력 필드에서 편리하게 편집할 수 있으며, 인라인 진단 메시지를 실시간으로 제공합니다.</w:t>
+        <w:t xml:space="preserve">선택된 키의 언어별 번역값을 개별 입력 필드에서 편리하게 편집할 수 있으며, 인라인 진단 메시지를 실시간으로 제공합니다. 참조 문장과 빈 언어가 있을 때 [AI 번역 제안] 버튼이 활성화되어 원클릭 번역 추천을 받을 수 있습니다.</w:t>
       </w:r>
     </w:p>
     <w:p>
@@ -4511,7 +4851,7 @@
           <w:sz w:val="20"/>
           <w:lang w:eastAsia="ko-KR"/>
         </w:rPr>
-        <w:t xml:space="preserve">에디터 상단의 예외키 버튼을 통해 번역할 필요가 없는 주석이나 섹션 구분용 예외 키(예: __section__, __comment__)를 지정하여 작업 표에서 숨길 수 있습니다. 파일을 저장할 때는 원래 있던 자리 그대로 안전하게 보존되어 파일 구조가 깨지지 않습니다.</w:t>
+        <w:t xml:space="preserve">1) 번역 제외 키(예외 키) 안전 보호: 에디터 상단의 예외키 버튼을 통해 번역할 필요가 없는 주석이나 섹션 구분용 예외 키(예: __section__, __comment__)를 지정하여 작업 표에서 숨길 수 있습니다. 파일을 저장할 때는 원래 있던 자리 그대로 안전하게 보존되어 파일 구조가 깨지지 않습니다.</w:t>
       </w:r>
     </w:p>
     <w:p>
@@ -4576,22 +4916,6 @@
     <w:p>
       <w:pPr>
         <w:jc w:val="left"/>
-        <w:spacing w:before="240" w:after="100" w:line="280" w:lineRule="auto"/>
-      </w:pPr>
-      <w:r>
-        <w:rPr>
-          <w:rFonts w:ascii="Apple SD Gothic Neo" w:hAnsi="Apple SD Gothic Neo" w:eastAsia="Apple SD Gothic Neo"/>
-          <w:color w:val="2C5282"/>
-          <w:sz w:val="26"/>
-          <w:b/>
-          <w:lang w:eastAsia="ko-KR"/>
-        </w:rPr>
-        <w:t xml:space="preserve">3.8 프로젝트 맞춤 환경 설정 (LocaleGridSettings)</w:t>
-      </w:r>
-    </w:p>
-    <w:p>
-      <w:pPr>
-        <w:jc w:val="left"/>
         <w:spacing w:before="60" w:after="80" w:line="280" w:lineRule="auto"/>
       </w:pPr>
       <w:r>
@@ -4601,7 +4925,7 @@
           <w:sz w:val="20"/>
           <w:lang w:eastAsia="ko-KR"/>
         </w:rPr>
-        <w:t xml:space="preserve">IntelliJ 환경 설정(Settings &gt; Tools &gt; LocaleGrid)에서 팀의 개발 규칙과 편의에 맞추어 번역 파일 저장 위치, 언어 표시 순서, 저장 시 들여쓰기 서식(2칸/4칸), 타 언어 문자 검사 규칙 및 처리 정책(경고 표시 또는 저장 차단)을 자유롭게 설정할 수 있습니다. 편집 중인 내용이 남아 있을 때는 설정 변경을 안전하게 제한하여 데이터가 엉키지 않도록 보호합니다.</w:t>
+        <w:t xml:space="preserve">2) 프로젝트 맞춤 환경 설정: IntelliJ 환경 설정(Settings &gt; Tools &gt; LocaleGrid)에서 팀의 개발 규칙과 편의에 맞추어 번역 파일 저장 위치, 언어 표시 순서, 저장 시 들여쓰기 서식(2칸/4칸), 타 언어 문자 검사 규칙 및 처리 정책(경고 표시 또는 저장 차단)을 자유롭게 설정할 수 있습니다. 특히 사내 서빙 인스턴스(Qwen, DeepSeek, Llama 등) 및 OpenAI 호환 엔드포인트 URL, 모델 식별자, API Key, 타임아웃을 설정하고 [연결 테스트] 버튼으로 통신 상태를 즉각 점검할 수 있습니다.</w:t>
       </w:r>
     </w:p>
     <w:p>
@@ -4612,7 +4936,7 @@
       <w:r>
         <w:drawing>
           <wp:inline distT="0" distB="0" distL="0" distR="0">
-            <wp:extent cx="5300000" cy="3876660"/>
+            <wp:extent cx="5300000" cy="3353061"/>
             <wp:effectExtent l="0" t="0" r="0" b="0"/>
             <wp:docPr id="614" name="Picture 614"/>
             <wp:cNvGraphicFramePr>
@@ -4622,11 +4946,11 @@
               <a:graphicData uri="http://schemas.openxmlformats.org/drawingml/2006/picture">
                 <pic:pic xmlns:pic="http://schemas.openxmlformats.org/drawingml/2006/picture">
                   <pic:nvPicPr>
-                    <pic:cNvPr id="614" name="img8.png"/>
+                    <pic:cNvPr id="614" name="img16.png"/>
                     <pic:cNvPicPr/>
                   </pic:nvPicPr>
                   <pic:blipFill>
-                    <a:blip r:embed="rId108"/>
+                    <a:blip r:embed="rId116"/>
                     <a:stretch>
                       <a:fillRect/>
                     </a:stretch>
@@ -4634,7 +4958,7 @@
                   <pic:spPr>
                     <a:xfrm>
                       <a:off x="0" y="0"/>
-                      <a:ext cx="5300000" cy="3876660"/>
+                      <a:ext cx="5300000" cy="3353061"/>
                     </a:xfrm>
                     <a:prstGeom prst="rect">
                       <a:avLst/>
@@ -4660,7 +4984,142 @@
           <w:sz w:val="18"/>
           <w:lang w:eastAsia="ko-KR"/>
         </w:rPr>
-        <w:t xml:space="preserve">[그림 8] 프로젝트 맞춤 환경 설정 화면: 번역 파일 위치, 언어 표시 순서, 들여쓰기 서식 및 문자 검사 규칙 설정</w:t>
+        <w:t xml:space="preserve">[그림 8] 프로젝트 맞춤 환경 설정 화면: 번역 파일 위치, 언어 표시 순서 및 사내 AI 번역 제안(LLM 연동) 환경 설정</w:t>
+      </w:r>
+    </w:p>
+    <w:p>
+      <w:pPr>
+        <w:jc w:val="left"/>
+        <w:spacing w:before="240" w:after="100" w:line="280" w:lineRule="auto"/>
+      </w:pPr>
+      <w:r>
+        <w:rPr>
+          <w:rFonts w:ascii="Apple SD Gothic Neo" w:hAnsi="Apple SD Gothic Neo" w:eastAsia="Apple SD Gothic Neo"/>
+          <w:color w:val="2C5282"/>
+          <w:sz w:val="26"/>
+          <w:b/>
+          <w:lang w:eastAsia="ko-KR"/>
+        </w:rPr>
+        <w:t xml:space="preserve">3.8 사내 AI 다국어 번역 제안 (LLM 연동)</w:t>
+      </w:r>
+    </w:p>
+    <w:p>
+      <w:pPr>
+        <w:jc w:val="left"/>
+        <w:spacing w:before="60" w:after="80" w:line="280" w:lineRule="auto"/>
+      </w:pPr>
+      <w:r>
+        <w:rPr>
+          <w:rFonts w:ascii="Apple SD Gothic Neo" w:hAnsi="Apple SD Gothic Neo" w:eastAsia="Apple SD Gothic Neo"/>
+          <w:color w:val="374151"/>
+          <w:sz w:val="20"/>
+          <w:lang w:eastAsia="ko-KR"/>
+        </w:rPr>
+        <w:t xml:space="preserve">1) 사내 로컬 LLM 연동 및 사내 보안 유지: 사내 폐쇄망 환경에서 자체 호스팅 중인 로컬 LLM(Qwen, DeepSeek, Llama 등) 및 OpenAI 호환 규격의 엔드포인트와 연동하여, 다국어 리소스가 외부 클라우드로 유출될 걱정 없이 안전하게 다국어 번역 초안을 작성할 수 있습니다.</w:t>
+      </w:r>
+    </w:p>
+    <w:p>
+      <w:pPr>
+        <w:jc w:val="center"/>
+        <w:spacing w:before="160" w:after="60"/>
+      </w:pPr>
+      <w:r>
+        <w:drawing>
+          <wp:inline distT="0" distB="0" distL="0" distR="0">
+            <wp:extent cx="5300000" cy="3949121"/>
+            <wp:effectExtent l="0" t="0" r="0" b="0"/>
+            <wp:docPr id="615" name="Picture 615"/>
+            <wp:cNvGraphicFramePr>
+              <a:graphicFrameLocks xmlns:a="http://schemas.openxmlformats.org/drawingml/2006/main" noChangeAspect="1"/>
+            </wp:cNvGraphicFramePr>
+            <a:graphic xmlns:a="http://schemas.openxmlformats.org/drawingml/2006/main">
+              <a:graphicData uri="http://schemas.openxmlformats.org/drawingml/2006/picture">
+                <pic:pic xmlns:pic="http://schemas.openxmlformats.org/drawingml/2006/picture">
+                  <pic:nvPicPr>
+                    <pic:cNvPr id="615" name="img15.png"/>
+                    <pic:cNvPicPr/>
+                  </pic:nvPicPr>
+                  <pic:blipFill>
+                    <a:blip r:embed="rId115"/>
+                    <a:stretch>
+                      <a:fillRect/>
+                    </a:stretch>
+                  </pic:blipFill>
+                  <pic:spPr>
+                    <a:xfrm>
+                      <a:off x="0" y="0"/>
+                      <a:ext cx="5300000" cy="3949121"/>
+                    </a:xfrm>
+                    <a:prstGeom prst="rect">
+                      <a:avLst/>
+                    </a:prstGeom>
+                  </pic:spPr>
+                </pic:pic>
+              </a:graphicData>
+            </a:graphic>
+          </wp:inline>
+        </w:drawing>
+      </w:r>
+    </w:p>
+    <w:p>
+      <w:pPr>
+        <w:jc w:val="center"/>
+        <w:spacing w:before="40" w:after="160"/>
+      </w:pPr>
+      <w:r>
+        <w:rPr>
+          <w:rFonts w:ascii="Apple SD Gothic Neo" w:hAnsi="Apple SD Gothic Neo" w:eastAsia="Apple SD Gothic Neo"/>
+          <w:b/>
+          <w:color w:val="4B5563"/>
+          <w:sz w:val="18"/>
+          <w:lang w:eastAsia="ko-KR"/>
+        </w:rPr>
+        <w:t xml:space="preserve">[그림 9] 사내 AI 다국어 번역 제안 화면: 하단 상세 패널의 [AI 번역 제안] 버튼과 빈 언어 항목에 노출되는 대화형 추천 번역 칩</w:t>
+      </w:r>
+    </w:p>
+    <w:p>
+      <w:pPr>
+        <w:jc w:val="left"/>
+        <w:spacing w:before="60" w:after="80" w:line="280" w:lineRule="auto"/>
+      </w:pPr>
+      <w:r>
+        <w:rPr>
+          <w:rFonts w:ascii="Apple SD Gothic Neo" w:hAnsi="Apple SD Gothic Neo" w:eastAsia="Apple SD Gothic Neo"/>
+          <w:color w:val="374151"/>
+          <w:sz w:val="20"/>
+          <w:lang w:eastAsia="ko-KR"/>
+        </w:rPr>
+        <w:t xml:space="preserve">2) 지능형 활성화 조건 및 상태 안내 분리: 하단 상세 패널 키명 우측의 [AI 번역 제안] 버튼은 기준이 되는 참조 언어가 1개 이상 존재하고, 비어 있는 번역 대상 언어가 있을 때만 활성화됩니다. 모든 언어가 이미 입력되어 있으면 불필요한 요청을 방지하기 위해 버튼이 자동으로 비활성화됩니다. AI 요청 진행 상태(전송 중, 성공, 실패 안내)는 버튼 바로 오른쪽에 동일한 글꼴 크기로 표시되며, 기존 하단 상태바의 정보(카테고리, 전체 행 수, 편집/오류/경고 카운트)를 손상시키지 않고 그대로 보존합니다.</w:t>
+      </w:r>
+    </w:p>
+    <w:p>
+      <w:pPr>
+        <w:jc w:val="left"/>
+        <w:spacing w:before="60" w:after="80" w:line="280" w:lineRule="auto"/>
+      </w:pPr>
+      <w:r>
+        <w:rPr>
+          <w:rFonts w:ascii="Apple SD Gothic Neo" w:hAnsi="Apple SD Gothic Neo" w:eastAsia="Apple SD Gothic Neo"/>
+          <w:color w:val="374151"/>
+          <w:sz w:val="20"/>
+          <w:lang w:eastAsia="ko-KR"/>
+        </w:rPr>
+        <w:t xml:space="preserve">3) 대화형 추천 번역 칩 (TranslationSuggestionChip): 추천 문구는 작은 보라색 별 아이콘이 달린 칩 형태로 표시되며, 마우스 클릭 한 번 또는 키보드 포커스 상태에서 Enter / Space 키를 눌러 입력란에 즉시 반영할 수 있습니다. 적용 시 해당 행은 일반 [편집] 상태로 전환되어 안전한 저장 파이프라인으로 연결됩니다. 칩 우측의 닫기(×) 버튼을 누르면 추천 문구를 반영하지 않고 제안 칩만 깔끔하게 제거합니다. 가용 너비를 초과하는 긴 문구는 자동으로 한 줄 말줄임 처리되고 마우스 호버 시 툴팁을 통해 전체 원문을 온전하게 확인할 수 있습니다.</w:t>
+      </w:r>
+    </w:p>
+    <w:p>
+      <w:pPr>
+        <w:jc w:val="left"/>
+        <w:spacing w:before="60" w:after="80" w:line="280" w:lineRule="auto"/>
+      </w:pPr>
+      <w:r>
+        <w:rPr>
+          <w:rFonts w:ascii="Apple SD Gothic Neo" w:hAnsi="Apple SD Gothic Neo" w:eastAsia="Apple SD Gothic Neo"/>
+          <w:color w:val="374151"/>
+          <w:sz w:val="20"/>
+          <w:lang w:eastAsia="ko-KR"/>
+        </w:rPr>
+        <w:t xml:space="preserve">4) 사내 모델 최적화 및 견고한 오류 제어: Qwen 등 사내 추론 모델에서 발생할 수 있는 불필요한 생각(thinking) 출력을 비활성화하고, 엄격한 JSON 구조 응답을 유도하는 맞춤형 프롬프트를 적용했습니다. 지원하지 않는 파라미터는 자동으로 호환 처리하며, 응답 잘림 현상을 진단하여 실패 시 명확한 원인을 안내합니다.</w:t>
       </w:r>
     </w:p>
     <w:p>
@@ -4787,7 +5246,7 @@
           <w:sz w:val="20"/>
           <w:lang w:eastAsia="ko-KR"/>
         </w:rPr>
-        <w:t xml:space="preserve">초경량 무의존 엑셀 내보내기: </w:t>
+        <w:t xml:space="preserve">키보드 양방향 순환 탐색: </w:t>
       </w:r>
       <w:r>
         <w:rPr>
@@ -4796,7 +5255,7 @@
           <w:sz w:val="20"/>
           <w:lang w:eastAsia="ko-KR"/>
         </w:rPr>
-        <w:t xml:space="preserve">별도의 무거운 외부 라이브러리 없이 가볍고 빠르게 수천 개 행의 다국어 리소스를 고속 엑셀 파일로 변환.</w:t>
+        <w:t xml:space="preserve">검색창 방향키(↑/↓), Enter/Shift+Enter 및 테이블 F3/Shift+F3 키를 통한 일치 결과 초고속 양방향 순환 탐색 지원.</w:t>
       </w:r>
     </w:p>
     <w:p>
@@ -4822,6 +5281,76 @@
           <w:sz w:val="20"/>
           <w:lang w:eastAsia="ko-KR"/>
         </w:rPr>
+        <w:t xml:space="preserve">사내 AI 다국어 번역 제안: </w:t>
+      </w:r>
+      <w:r>
+        <w:rPr>
+          <w:rFonts w:ascii="Apple SD Gothic Neo" w:hAnsi="Apple SD Gothic Neo" w:eastAsia="Apple SD Gothic Neo"/>
+          <w:color w:val="374151"/>
+          <w:sz w:val="20"/>
+          <w:lang w:eastAsia="ko-KR"/>
+        </w:rPr>
+        <w:t xml:space="preserve">외부 상용망 유출 없는 사내 로컬 LLM 연동으로 빈 언어 번역을 원클릭으로 추천받아 초안 작성 시간 대폭 단축.</w:t>
+      </w:r>
+    </w:p>
+    <w:p>
+      <w:pPr>
+        <w:spacing w:before="40" w:after="40" w:line="260" w:lineRule="auto"/>
+        <w:ind w:left="360" w:hanging="240"/>
+      </w:pPr>
+      <w:r>
+        <w:rPr>
+          <w:rFonts w:ascii="Apple SD Gothic Neo" w:hAnsi="Apple SD Gothic Neo" w:eastAsia="Apple SD Gothic Neo"/>
+          <w:color w:val="2563EB"/>
+          <w:b/>
+          <w:sz w:val="20"/>
+          <w:lang w:eastAsia="ko-KR"/>
+        </w:rPr>
+        <w:t xml:space="preserve">•  </w:t>
+      </w:r>
+      <w:r>
+        <w:rPr>
+          <w:rFonts w:ascii="Apple SD Gothic Neo" w:hAnsi="Apple SD Gothic Neo" w:eastAsia="Apple SD Gothic Neo"/>
+          <w:color w:val="1E3A5F"/>
+          <w:b/>
+          <w:sz w:val="20"/>
+          <w:lang w:eastAsia="ko-KR"/>
+        </w:rPr>
+        <w:t xml:space="preserve">초경량 무의존 엑셀 내보내기: </w:t>
+      </w:r>
+      <w:r>
+        <w:rPr>
+          <w:rFonts w:ascii="Apple SD Gothic Neo" w:hAnsi="Apple SD Gothic Neo" w:eastAsia="Apple SD Gothic Neo"/>
+          <w:color w:val="374151"/>
+          <w:sz w:val="20"/>
+          <w:lang w:eastAsia="ko-KR"/>
+        </w:rPr>
+        <w:t xml:space="preserve">별도의 무거운 외부 라이브러리 없이 가볍고 빠르게 수천 개 행의 다국어 리소스를 고속 엑셀 파일로 변환.</w:t>
+      </w:r>
+    </w:p>
+    <w:p>
+      <w:pPr>
+        <w:spacing w:before="40" w:after="40" w:line="260" w:lineRule="auto"/>
+        <w:ind w:left="360" w:hanging="240"/>
+      </w:pPr>
+      <w:r>
+        <w:rPr>
+          <w:rFonts w:ascii="Apple SD Gothic Neo" w:hAnsi="Apple SD Gothic Neo" w:eastAsia="Apple SD Gothic Neo"/>
+          <w:color w:val="2563EB"/>
+          <w:b/>
+          <w:sz w:val="20"/>
+          <w:lang w:eastAsia="ko-KR"/>
+        </w:rPr>
+        <w:t xml:space="preserve">•  </w:t>
+      </w:r>
+      <w:r>
+        <w:rPr>
+          <w:rFonts w:ascii="Apple SD Gothic Neo" w:hAnsi="Apple SD Gothic Neo" w:eastAsia="Apple SD Gothic Neo"/>
+          <w:color w:val="1E3A5F"/>
+          <w:b/>
+          <w:sz w:val="20"/>
+          <w:lang w:eastAsia="ko-KR"/>
+        </w:rPr>
         <w:t xml:space="preserve">문자 체계 자동 검사: </w:t>
       </w:r>
       <w:r>
@@ -4832,6 +5361,35 @@
           <w:lang w:eastAsia="ko-KR"/>
         </w:rPr>
         <w:t xml:space="preserve">다국어 파일에 다른 나라 문자가 잘못 입력되는 실수를 실시간으로 감지하여 데이터 정확성 보장.</w:t>
+      </w:r>
+    </w:p>
+    <w:p>
+      <w:pPr>
+        <w:pBdr>
+          <w:left w:val="single" w:sz="24" w:space="15" w:color="2563EB"/>
+        </w:pBdr>
+        <w:shd w:val="clear" w:fill="F0F7FF"/>
+        <w:spacing w:before="120" w:after="120" w:line="280" w:lineRule="auto"/>
+        <w:ind w:left="200" w:right="200"/>
+      </w:pPr>
+      <w:r>
+        <w:rPr>
+          <w:rFonts w:ascii="Apple SD Gothic Neo" w:hAnsi="Apple SD Gothic Neo" w:eastAsia="Apple SD Gothic Neo"/>
+          <w:b/>
+          <w:color w:val="1E40AF"/>
+          <w:sz w:val="20"/>
+          <w:lang w:eastAsia="ko-KR"/>
+        </w:rPr>
+        <w:t xml:space="preserve">📌 품질 검증 상태: </w:t>
+      </w:r>
+      <w:r>
+        <w:rPr>
+          <w:rFonts w:ascii="Apple SD Gothic Neo" w:hAnsi="Apple SD Gothic Neo" w:eastAsia="Apple SD Gothic Neo"/>
+          <w:color w:val="1E293B"/>
+          <w:sz w:val="20"/>
+          <w:lang w:eastAsia="ko-KR"/>
+        </w:rPr>
+        <w:t xml:space="preserve">본 프로젝트는 프로덕션 코드 40개 파일과 21개 테스트 클래스(총 117개 자동화 테스트 케이스)를 구축하여 검증을 완료했습니다. JSON 표 변환 및 원본 복원, 문자 체계 검증, 엑셀 내보내기 포맷, 사내 LLM 비동기 통신 및 검색창·테이블 키보드 양방향 순환 탐색이 자동화 테스트로 철저히 검증됩니다.</w:t>
       </w:r>
     </w:p>
     <w:p>
@@ -4897,7 +5455,7 @@
           <w:sz w:val="20"/>
           <w:lang w:eastAsia="ko-KR"/>
         </w:rPr>
-        <w:t xml:space="preserve">다국어 파일 간의 누락된 키나 번역 불일치를 하나의 표에서 원클릭으로 비교 및 일괄 편집.</w:t>
+        <w:t xml:space="preserve">다국어 파일 간의 누락된 키나 번역 불일치를 하나의 표에서 원클릭으로 비교 및 일괄 편집하고, 사내 AI 번역 제안을 통해 초안 작성 속도를 비약적으로 향상.</w:t>
       </w:r>
     </w:p>
     <w:p>

</xml_diff>